<commit_message>
Rising Sun price list: one page summary and pricing scenarios
Co-Authored-By: Claude Sonnet 5.5 <noreply@anthropic.com>
Claude-Session: https://claude.ai/code/session_01HHRsqL7L57Qm5aUfHKQdYK
</commit_message>
<xml_diff>
--- a/rising-sun/Rising-Sun_Price-List_2026-10-20.docx
+++ b/rising-sun/Rising-Sun_Price-List_2026-10-20.docx
@@ -17,6 +17,94 @@
           <w:i w:val="0"/>
         </w:rPr>
         <w:t>Prepared for Dr. O for her meeting on Thursday 22 October 2026. Prices were looked up on 20 October 2026 and are a snapshot: they can change.</w:t>
+      </w:r>
+    </w:p>
+    <w:p>
+      <w:pPr>
+        <w:pStyle w:val="Heading1"/>
+      </w:pPr>
+      <w:r>
+        <w:t>The idea on one page</w:t>
+      </w:r>
+    </w:p>
+    <w:p>
+      <w:r>
+        <w:rPr>
+          <w:b w:val="0"/>
+          <w:i w:val="0"/>
+        </w:rPr>
+        <w:t>Dr. O designed the Rising Sun Court, a small court of seven fairies, and the two products that carry them.</w:t>
+      </w:r>
+    </w:p>
+    <w:p>
+      <w:r>
+        <w:rPr>
+          <w:b/>
+        </w:rPr>
+        <w:t xml:space="preserve">The light. </w:t>
+      </w:r>
+      <w:r>
+        <w:t>A bar of light that stands on a window sill and wakes you slowly, like the sun coming up. It needs no installation, so it is safe for rentals, and it comes in three widths to fit different windows. A fairy lives in it, and she can talk.</w:t>
+      </w:r>
+    </w:p>
+    <w:p>
+      <w:r>
+        <w:rPr>
+          <w:b/>
+        </w:rPr>
+        <w:t xml:space="preserve">The candle. </w:t>
+      </w:r>
+      <w:r>
+        <w:t>A flameless candle with one fairy in it. The fairy shows as a silhouette in the glow. The on and off switch puts her to sleep or wakes her. The candles are meant to be collected, and a base is planned to hold them.</w:t>
+      </w:r>
+    </w:p>
+    <w:p>
+      <w:r>
+        <w:rPr>
+          <w:b/>
+        </w:rPr>
+        <w:t xml:space="preserve">Why it is different. </w:t>
+      </w:r>
+      <w:r>
+        <w:t>The sunrise lights Dr. O compared cost from 0 to 5. None of them talks, and none has a character. Every fairy here has a voice, a story and a room to visit in Good Company.</w:t>
+      </w:r>
+    </w:p>
+    <w:p>
+      <w:r>
+        <w:rPr>
+          <w:b/>
+        </w:rPr>
+        <w:t xml:space="preserve">How it makes money. </w:t>
+      </w:r>
+      <w:r>
+        <w:t>Selling the light and the candles, and a monthly price for the fairy to talk. Neither price is decided yet. The scenarios below show what each would leave.</w:t>
+      </w:r>
+    </w:p>
+    <w:p>
+      <w:r>
+        <w:rPr>
+          <w:b/>
+        </w:rPr>
+        <w:t xml:space="preserve">Where it stands. </w:t>
+      </w:r>
+      <w:r>
+        <w:t>The fairies, their voices, the cloud brain and the web page are working now, and a visitor can try a preview. The prototype light and candle are not built yet. The parts are listed in this document with prices.</w:t>
+      </w:r>
+    </w:p>
+    <w:p>
+      <w:r>
+        <w:rPr>
+          <w:b/>
+        </w:rPr>
+        <w:t xml:space="preserve">What Dr. O is asking for on Thursday: </w:t>
+      </w:r>
+      <w:r>
+        <w:t>______________________________________________</w:t>
+      </w:r>
+    </w:p>
+    <w:p>
+      <w:r>
+        <w:br w:type="page"/>
       </w:r>
     </w:p>
     <w:p>
@@ -1689,6 +1777,548 @@
         <w:pStyle w:val="Heading1"/>
       </w:pPr>
       <w:r>
+        <w:t>Pricing scenarios</w:t>
+      </w:r>
+    </w:p>
+    <w:p>
+      <w:r>
+        <w:rPr>
+          <w:b w:val="0"/>
+          <w:i w:val="0"/>
+        </w:rPr>
+        <w:t>These are arithmetic to help choose a price. None of these prices is a decision. The parts cost of 10 is the 24 inch prototype, about 0, plus 0 that is assumed for the acrylic until a supplier gives a quote. The product made by a manufacturer at volume should cost less per unit.</w:t>
+      </w:r>
+    </w:p>
+    <w:tbl>
+      <w:tblPr>
+        <w:tblStyle w:val="TableGrid"/>
+        <w:tblW w:type="auto" w:w="0"/>
+        <w:tblLook w:firstColumn="1" w:firstRow="1" w:lastColumn="0" w:lastRow="0" w:noHBand="0" w:noVBand="1" w:val="04A0"/>
+      </w:tblPr>
+      <w:tblGrid>
+        <w:gridCol w:w="2412"/>
+        <w:gridCol w:w="2412"/>
+        <w:gridCol w:w="2412"/>
+        <w:gridCol w:w="2412"/>
+      </w:tblGrid>
+      <w:tr>
+        <w:tc>
+          <w:tcPr>
+            <w:tcW w:type="dxa" w:w="3744"/>
+            <w:shd w:val="clear" w:color="auto" w:fill="F1E6D2"/>
+          </w:tcPr>
+          <w:p>
+            <w:r/>
+            <w:r>
+              <w:rPr>
+                <w:b/>
+                <w:sz w:val="20"/>
+              </w:rPr>
+              <w:t>The 24 inch light</w:t>
+            </w:r>
+          </w:p>
+        </w:tc>
+        <w:tc>
+          <w:tcPr>
+            <w:tcW w:type="dxa" w:w="2016"/>
+            <w:shd w:val="clear" w:color="auto" w:fill="F1E6D2"/>
+          </w:tcPr>
+          <w:p>
+            <w:r/>
+            <w:r>
+              <w:rPr>
+                <w:b/>
+                <w:sz w:val="20"/>
+              </w:rPr>
+              <w:t>Scenario 1</w:t>
+            </w:r>
+          </w:p>
+        </w:tc>
+        <w:tc>
+          <w:tcPr>
+            <w:tcW w:type="dxa" w:w="2016"/>
+            <w:shd w:val="clear" w:color="auto" w:fill="F1E6D2"/>
+          </w:tcPr>
+          <w:p>
+            <w:r/>
+            <w:r>
+              <w:rPr>
+                <w:b/>
+                <w:sz w:val="20"/>
+              </w:rPr>
+              <w:t>Scenario 2</w:t>
+            </w:r>
+          </w:p>
+        </w:tc>
+        <w:tc>
+          <w:tcPr>
+            <w:tcW w:type="dxa" w:w="2016"/>
+            <w:shd w:val="clear" w:color="auto" w:fill="F1E6D2"/>
+          </w:tcPr>
+          <w:p>
+            <w:r/>
+            <w:r>
+              <w:rPr>
+                <w:b/>
+                <w:sz w:val="20"/>
+              </w:rPr>
+              <w:t>Scenario 3</w:t>
+            </w:r>
+          </w:p>
+        </w:tc>
+      </w:tr>
+      <w:tr>
+        <w:tc>
+          <w:tcPr>
+            <w:tcW w:type="dxa" w:w="3744"/>
+          </w:tcPr>
+          <w:p>
+            <w:r/>
+            <w:r>
+              <w:rPr>
+                <w:sz w:val="20"/>
+              </w:rPr>
+              <w:t>Parts cost per light</w:t>
+            </w:r>
+          </w:p>
+        </w:tc>
+        <w:tc>
+          <w:tcPr>
+            <w:tcW w:type="dxa" w:w="2016"/>
+          </w:tcPr>
+          <w:p>
+            <w:r/>
+            <w:r>
+              <w:rPr>
+                <w:sz w:val="20"/>
+              </w:rPr>
+              <w:t>10</w:t>
+            </w:r>
+          </w:p>
+        </w:tc>
+        <w:tc>
+          <w:tcPr>
+            <w:tcW w:type="dxa" w:w="2016"/>
+          </w:tcPr>
+          <w:p>
+            <w:r/>
+            <w:r>
+              <w:rPr>
+                <w:sz w:val="20"/>
+              </w:rPr>
+              <w:t>10</w:t>
+            </w:r>
+          </w:p>
+        </w:tc>
+        <w:tc>
+          <w:tcPr>
+            <w:tcW w:type="dxa" w:w="2016"/>
+          </w:tcPr>
+          <w:p>
+            <w:r/>
+            <w:r>
+              <w:rPr>
+                <w:sz w:val="20"/>
+              </w:rPr>
+              <w:t>10</w:t>
+            </w:r>
+          </w:p>
+        </w:tc>
+      </w:tr>
+      <w:tr>
+        <w:tc>
+          <w:tcPr>
+            <w:tcW w:type="dxa" w:w="3744"/>
+          </w:tcPr>
+          <w:p>
+            <w:r/>
+            <w:r>
+              <w:rPr>
+                <w:sz w:val="20"/>
+              </w:rPr>
+              <w:t>Selling price</w:t>
+            </w:r>
+          </w:p>
+        </w:tc>
+        <w:tc>
+          <w:tcPr>
+            <w:tcW w:type="dxa" w:w="2016"/>
+          </w:tcPr>
+          <w:p>
+            <w:r/>
+            <w:r>
+              <w:rPr>
+                <w:sz w:val="20"/>
+              </w:rPr>
+              <w:t>49</w:t>
+            </w:r>
+          </w:p>
+        </w:tc>
+        <w:tc>
+          <w:tcPr>
+            <w:tcW w:type="dxa" w:w="2016"/>
+          </w:tcPr>
+          <w:p>
+            <w:r/>
+            <w:r>
+              <w:rPr>
+                <w:sz w:val="20"/>
+              </w:rPr>
+              <w:t>99</w:t>
+            </w:r>
+          </w:p>
+        </w:tc>
+        <w:tc>
+          <w:tcPr>
+            <w:tcW w:type="dxa" w:w="2016"/>
+          </w:tcPr>
+          <w:p>
+            <w:r/>
+            <w:r>
+              <w:rPr>
+                <w:sz w:val="20"/>
+              </w:rPr>
+              <w:t>49</w:t>
+            </w:r>
+          </w:p>
+        </w:tc>
+      </w:tr>
+      <w:tr>
+        <w:tc>
+          <w:tcPr>
+            <w:tcW w:type="dxa" w:w="3744"/>
+          </w:tcPr>
+          <w:p>
+            <w:r/>
+            <w:r>
+              <w:rPr>
+                <w:sz w:val="20"/>
+              </w:rPr>
+              <w:t>Left after parts</w:t>
+            </w:r>
+          </w:p>
+        </w:tc>
+        <w:tc>
+          <w:tcPr>
+            <w:tcW w:type="dxa" w:w="2016"/>
+          </w:tcPr>
+          <w:p>
+            <w:r/>
+            <w:r>
+              <w:rPr>
+                <w:sz w:val="20"/>
+              </w:rPr>
+              <w:t>9</w:t>
+            </w:r>
+          </w:p>
+        </w:tc>
+        <w:tc>
+          <w:tcPr>
+            <w:tcW w:type="dxa" w:w="2016"/>
+          </w:tcPr>
+          <w:p>
+            <w:r/>
+            <w:r>
+              <w:rPr>
+                <w:sz w:val="20"/>
+              </w:rPr>
+              <w:t>9</w:t>
+            </w:r>
+          </w:p>
+        </w:tc>
+        <w:tc>
+          <w:tcPr>
+            <w:tcW w:type="dxa" w:w="2016"/>
+          </w:tcPr>
+          <w:p>
+            <w:r/>
+            <w:r>
+              <w:rPr>
+                <w:sz w:val="20"/>
+              </w:rPr>
+              <w:t>39</w:t>
+            </w:r>
+          </w:p>
+        </w:tc>
+      </w:tr>
+      <w:tr>
+        <w:tc>
+          <w:tcPr>
+            <w:tcW w:type="dxa" w:w="3744"/>
+          </w:tcPr>
+          <w:p>
+            <w:r/>
+            <w:r>
+              <w:rPr>
+                <w:sz w:val="20"/>
+              </w:rPr>
+              <w:t>Share of the selling price</w:t>
+            </w:r>
+          </w:p>
+        </w:tc>
+        <w:tc>
+          <w:tcPr>
+            <w:tcW w:type="dxa" w:w="2016"/>
+          </w:tcPr>
+          <w:p>
+            <w:r/>
+            <w:r>
+              <w:rPr>
+                <w:sz w:val="20"/>
+              </w:rPr>
+              <w:t>26%</w:t>
+            </w:r>
+          </w:p>
+        </w:tc>
+        <w:tc>
+          <w:tcPr>
+            <w:tcW w:type="dxa" w:w="2016"/>
+          </w:tcPr>
+          <w:p>
+            <w:r/>
+            <w:r>
+              <w:rPr>
+                <w:sz w:val="20"/>
+              </w:rPr>
+              <w:t>45%</w:t>
+            </w:r>
+          </w:p>
+        </w:tc>
+        <w:tc>
+          <w:tcPr>
+            <w:tcW w:type="dxa" w:w="2016"/>
+          </w:tcPr>
+          <w:p>
+            <w:r/>
+            <w:r>
+              <w:rPr>
+                <w:sz w:val="20"/>
+              </w:rPr>
+              <w:t>56%</w:t>
+            </w:r>
+          </w:p>
+        </w:tc>
+      </w:tr>
+    </w:tbl>
+    <w:p/>
+    <w:p>
+      <w:r>
+        <w:rPr>
+          <w:b w:val="0"/>
+          <w:i w:val="0"/>
+        </w:rPr>
+        <w:t>Not yet taken out of the amount left: shipping, sales channel fees, returns, packaging, and the cost of making and testing the electronics in volume.</w:t>
+      </w:r>
+    </w:p>
+    <w:tbl>
+      <w:tblPr>
+        <w:tblStyle w:val="TableGrid"/>
+        <w:tblW w:type="auto" w:w="0"/>
+        <w:tblLook w:firstColumn="1" w:firstRow="1" w:lastColumn="0" w:lastRow="0" w:noHBand="0" w:noVBand="1" w:val="04A0"/>
+      </w:tblPr>
+      <w:tblGrid>
+        <w:gridCol w:w="2412"/>
+        <w:gridCol w:w="2412"/>
+        <w:gridCol w:w="2412"/>
+        <w:gridCol w:w="2412"/>
+      </w:tblGrid>
+      <w:tr>
+        <w:tc>
+          <w:tcPr>
+            <w:tcW w:type="dxa" w:w="3744"/>
+            <w:shd w:val="clear" w:color="auto" w:fill="F1E6D2"/>
+          </w:tcPr>
+          <w:p>
+            <w:r/>
+            <w:r>
+              <w:rPr>
+                <w:b/>
+                <w:sz w:val="20"/>
+              </w:rPr>
+              <w:t>Fairy subscription</w:t>
+            </w:r>
+          </w:p>
+        </w:tc>
+        <w:tc>
+          <w:tcPr>
+            <w:tcW w:type="dxa" w:w="2016"/>
+            <w:shd w:val="clear" w:color="auto" w:fill="F1E6D2"/>
+          </w:tcPr>
+          <w:p>
+            <w:r/>
+            <w:r>
+              <w:rPr>
+                <w:b/>
+                <w:sz w:val="20"/>
+              </w:rPr>
+              <w:t>Scenario 1</w:t>
+            </w:r>
+          </w:p>
+        </w:tc>
+        <w:tc>
+          <w:tcPr>
+            <w:tcW w:type="dxa" w:w="2016"/>
+            <w:shd w:val="clear" w:color="auto" w:fill="F1E6D2"/>
+          </w:tcPr>
+          <w:p>
+            <w:r/>
+            <w:r>
+              <w:rPr>
+                <w:b/>
+                <w:sz w:val="20"/>
+              </w:rPr>
+              <w:t>Scenario 2</w:t>
+            </w:r>
+          </w:p>
+        </w:tc>
+        <w:tc>
+          <w:tcPr>
+            <w:tcW w:type="dxa" w:w="2016"/>
+            <w:shd w:val="clear" w:color="auto" w:fill="F1E6D2"/>
+          </w:tcPr>
+          <w:p>
+            <w:r/>
+            <w:r>
+              <w:rPr>
+                <w:b/>
+                <w:sz w:val="20"/>
+              </w:rPr>
+              <w:t>Scenario 3</w:t>
+            </w:r>
+          </w:p>
+        </w:tc>
+      </w:tr>
+      <w:tr>
+        <w:tc>
+          <w:tcPr>
+            <w:tcW w:type="dxa" w:w="3744"/>
+          </w:tcPr>
+          <w:p>
+            <w:r/>
+            <w:r>
+              <w:rPr>
+                <w:sz w:val="20"/>
+              </w:rPr>
+              <w:t>Monthly price</w:t>
+            </w:r>
+          </w:p>
+        </w:tc>
+        <w:tc>
+          <w:tcPr>
+            <w:tcW w:type="dxa" w:w="2016"/>
+          </w:tcPr>
+          <w:p>
+            <w:r/>
+            <w:r>
+              <w:rPr>
+                <w:sz w:val="20"/>
+              </w:rPr>
+            </w:r>
+          </w:p>
+        </w:tc>
+        <w:tc>
+          <w:tcPr>
+            <w:tcW w:type="dxa" w:w="2016"/>
+          </w:tcPr>
+          <w:p>
+            <w:r/>
+            <w:r>
+              <w:rPr>
+                <w:sz w:val="20"/>
+              </w:rPr>
+              <w:t>0</w:t>
+            </w:r>
+          </w:p>
+        </w:tc>
+        <w:tc>
+          <w:tcPr>
+            <w:tcW w:type="dxa" w:w="2016"/>
+          </w:tcPr>
+          <w:p>
+            <w:r/>
+            <w:r>
+              <w:rPr>
+                <w:sz w:val="20"/>
+              </w:rPr>
+              <w:t>5</w:t>
+            </w:r>
+          </w:p>
+        </w:tc>
+      </w:tr>
+      <w:tr>
+        <w:tc>
+          <w:tcPr>
+            <w:tcW w:type="dxa" w:w="3744"/>
+          </w:tcPr>
+          <w:p>
+            <w:r/>
+            <w:r>
+              <w:rPr>
+                <w:sz w:val="20"/>
+              </w:rPr>
+              <w:t>Per customer per year</w:t>
+            </w:r>
+          </w:p>
+        </w:tc>
+        <w:tc>
+          <w:tcPr>
+            <w:tcW w:type="dxa" w:w="2016"/>
+          </w:tcPr>
+          <w:p>
+            <w:r/>
+            <w:r>
+              <w:rPr>
+                <w:sz w:val="20"/>
+              </w:rPr>
+              <w:t>0</w:t>
+            </w:r>
+          </w:p>
+        </w:tc>
+        <w:tc>
+          <w:tcPr>
+            <w:tcW w:type="dxa" w:w="2016"/>
+          </w:tcPr>
+          <w:p>
+            <w:r/>
+            <w:r>
+              <w:rPr>
+                <w:sz w:val="20"/>
+              </w:rPr>
+              <w:t>20</w:t>
+            </w:r>
+          </w:p>
+        </w:tc>
+        <w:tc>
+          <w:tcPr>
+            <w:tcW w:type="dxa" w:w="2016"/>
+          </w:tcPr>
+          <w:p>
+            <w:r/>
+            <w:r>
+              <w:rPr>
+                <w:sz w:val="20"/>
+              </w:rPr>
+              <w:t>80</w:t>
+            </w:r>
+          </w:p>
+        </w:tc>
+      </w:tr>
+    </w:tbl>
+    <w:p/>
+    <w:p>
+      <w:r>
+        <w:rPr>
+          <w:b w:val="0"/>
+          <w:i w:val="0"/>
+        </w:rPr>
+        <w:t>Before the provider costs for the fairy to think and speak, which have not been measured. They need to be measured before a monthly price is chosen. A subscription is why a 49 light could still make sense: the fairy keeps earning after the sale.</w:t>
+      </w:r>
+    </w:p>
+    <w:p>
+      <w:pPr>
+        <w:pStyle w:val="Heading1"/>
+      </w:pPr>
+      <w:r>
         <w:t>4. Still to be decided by Dr. O</w:t>
       </w:r>
     </w:p>

</xml_diff>

<commit_message>
Rising Sun price list: partnership proposal and agreement terms
Co-Authored-By: Claude Sonnet 5.5 <noreply@anthropic.com>
Claude-Session: https://claude.ai/code/session_01HHRsqL7L57Qm5aUfHKQdYK
</commit_message>
<xml_diff>
--- a/rising-sun/Rising-Sun_Price-List_2026-10-20.docx
+++ b/rising-sun/Rising-Sun_Price-List_2026-10-20.docx
@@ -2410,6 +2410,300 @@
         <w:t>Any time spent building. This is the cost of parts for one prototype, not a product cost.</w:t>
       </w:r>
     </w:p>
+    <w:p>
+      <w:pPr>
+        <w:pStyle w:val="Heading1"/>
+      </w:pPr>
+      <w:r>
+        <w:t>6. Partnership proposal, in three phases</w:t>
+      </w:r>
+    </w:p>
+    <w:p>
+      <w:r>
+        <w:rPr>
+          <w:b w:val="0"/>
+          <w:i w:val="0"/>
+        </w:rPr>
+        <w:t>The vision, designed by Dr. O: a store at the front and a workshop at the back behind a glass window, so visitors can watch the work. A 3D printer makes the figurines, and a poster shows all of them so children can guess which one is being printed. The workers wear aprons, like a cobbler’s shop. Robots greet you at the door, and there is tea with a bot and a fireside chat. A figurine talks when it is placed on a bench. Cubicles let visitors try the software products, and holo boxes let them sit and talk with a hologram. The Rising Sun Court fairy lines are sold there. Students intern in the workshop and learn how the robots and the products are made, from the ground up.</w:t>
+      </w:r>
+    </w:p>
+    <w:tbl>
+      <w:tblPr>
+        <w:tblStyle w:val="TableGrid"/>
+        <w:tblW w:type="auto" w:w="0"/>
+        <w:tblLook w:firstColumn="1" w:firstRow="1" w:lastColumn="0" w:lastRow="0" w:noHBand="0" w:noVBand="1" w:val="04A0"/>
+      </w:tblPr>
+      <w:tblGrid>
+        <w:gridCol w:w="3216"/>
+        <w:gridCol w:w="3216"/>
+        <w:gridCol w:w="3216"/>
+      </w:tblGrid>
+      <w:tr>
+        <w:tc>
+          <w:tcPr>
+            <w:tcW w:type="dxa" w:w="1872"/>
+            <w:shd w:val="clear" w:color="auto" w:fill="F1E6D2"/>
+          </w:tcPr>
+          <w:p>
+            <w:r/>
+            <w:r>
+              <w:rPr>
+                <w:b/>
+                <w:sz w:val="20"/>
+              </w:rPr>
+              <w:t>Phase</w:t>
+            </w:r>
+          </w:p>
+        </w:tc>
+        <w:tc>
+          <w:tcPr>
+            <w:tcW w:type="dxa" w:w="4176"/>
+            <w:shd w:val="clear" w:color="auto" w:fill="F1E6D2"/>
+          </w:tcPr>
+          <w:p>
+            <w:r/>
+            <w:r>
+              <w:rPr>
+                <w:b/>
+                <w:sz w:val="20"/>
+              </w:rPr>
+              <w:t>Dr. O provides</w:t>
+            </w:r>
+          </w:p>
+        </w:tc>
+        <w:tc>
+          <w:tcPr>
+            <w:tcW w:type="dxa" w:w="3888"/>
+            <w:shd w:val="clear" w:color="auto" w:fill="F1E6D2"/>
+          </w:tcPr>
+          <w:p>
+            <w:r/>
+            <w:r>
+              <w:rPr>
+                <w:b/>
+                <w:sz w:val="20"/>
+              </w:rPr>
+              <w:t>The business school provides</w:t>
+            </w:r>
+          </w:p>
+        </w:tc>
+      </w:tr>
+      <w:tr>
+        <w:tc>
+          <w:tcPr>
+            <w:tcW w:type="dxa" w:w="1872"/>
+          </w:tcPr>
+          <w:p>
+            <w:r/>
+            <w:r>
+              <w:rPr>
+                <w:sz w:val="20"/>
+              </w:rPr>
+              <w:t>1. This semester</w:t>
+            </w:r>
+          </w:p>
+        </w:tc>
+        <w:tc>
+          <w:tcPr>
+            <w:tcW w:type="dxa" w:w="4176"/>
+          </w:tcPr>
+          <w:p>
+            <w:r/>
+            <w:r>
+              <w:rPr>
+                <w:sz w:val="20"/>
+              </w:rPr>
+              <w:t>The product, the price scenarios, the open questions, and supervision of the student work.</w:t>
+            </w:r>
+          </w:p>
+        </w:tc>
+        <w:tc>
+          <w:tcPr>
+            <w:tcW w:type="dxa" w:w="3888"/>
+          </w:tcPr>
+          <w:p>
+            <w:r/>
+            <w:r>
+              <w:rPr>
+                <w:sz w:val="20"/>
+              </w:rPr>
+              <w:t>Student project teams for market research, pricing and the go-to-market plan, and faculty advisors.</w:t>
+            </w:r>
+          </w:p>
+        </w:tc>
+      </w:tr>
+      <w:tr>
+        <w:tc>
+          <w:tcPr>
+            <w:tcW w:type="dxa" w:w="1872"/>
+          </w:tcPr>
+          <w:p>
+            <w:r/>
+            <w:r>
+              <w:rPr>
+                <w:sz w:val="20"/>
+              </w:rPr>
+              <w:t>2. Next semester</w:t>
+            </w:r>
+          </w:p>
+        </w:tc>
+        <w:tc>
+          <w:tcPr>
+            <w:tcW w:type="dxa" w:w="4176"/>
+          </w:tcPr>
+          <w:p>
+            <w:r/>
+            <w:r>
+              <w:rPr>
+                <w:sz w:val="20"/>
+              </w:rPr>
+              <w:t>The workshop design, the figurines, the holo boxes, the fairies, and the display.</w:t>
+            </w:r>
+          </w:p>
+        </w:tc>
+        <w:tc>
+          <w:tcPr>
+            <w:tcW w:type="dxa" w:w="3888"/>
+          </w:tcPr>
+          <w:p>
+            <w:r/>
+            <w:r>
+              <w:rPr>
+                <w:sz w:val="20"/>
+              </w:rPr>
+              <w:t>Space for a pop-up with the glass-window workshop, and internships through the school’s internship office.</w:t>
+            </w:r>
+          </w:p>
+        </w:tc>
+      </w:tr>
+      <w:tr>
+        <w:tc>
+          <w:tcPr>
+            <w:tcW w:type="dxa" w:w="1872"/>
+          </w:tcPr>
+          <w:p>
+            <w:r/>
+            <w:r>
+              <w:rPr>
+                <w:sz w:val="20"/>
+              </w:rPr>
+              <w:t>3. After the pilot</w:t>
+            </w:r>
+          </w:p>
+        </w:tc>
+        <w:tc>
+          <w:tcPr>
+            <w:tcW w:type="dxa" w:w="4176"/>
+          </w:tcPr>
+          <w:p>
+            <w:r/>
+            <w:r>
+              <w:rPr>
+                <w:sz w:val="20"/>
+              </w:rPr>
+              <w:t>The store, the workshop and the products.</w:t>
+            </w:r>
+          </w:p>
+        </w:tc>
+        <w:tc>
+          <w:tcPr>
+            <w:tcW w:type="dxa" w:w="3888"/>
+          </w:tcPr>
+          <w:p>
+            <w:r/>
+            <w:r>
+              <w:rPr>
+                <w:sz w:val="20"/>
+              </w:rPr>
+              <w:t>Introductions to manufacturers, retailers and investors, and continued internships.</w:t>
+            </w:r>
+          </w:p>
+        </w:tc>
+      </w:tr>
+    </w:tbl>
+    <w:p/>
+    <w:p>
+      <w:r>
+        <w:rPr>
+          <w:b w:val="0"/>
+          <w:i/>
+        </w:rPr>
+        <w:t>Cloud credits: AWS and Azure require a company outside a university to partner with one to receive more credits. What the university must sign for that is to be confirmed with AWS and Azure before anything is promised.</w:t>
+      </w:r>
+    </w:p>
+    <w:p>
+      <w:pPr>
+        <w:pStyle w:val="Heading1"/>
+      </w:pPr>
+      <w:r>
+        <w:t>7. What the partnership agreement needs to say</w:t>
+      </w:r>
+    </w:p>
+    <w:p>
+      <w:r>
+        <w:rPr>
+          <w:b w:val="0"/>
+          <w:i/>
+        </w:rPr>
+        <w:t>Written for Dr. O and her lawyer to review before anything is signed. It is not legal advice.</w:t>
+      </w:r>
+    </w:p>
+    <w:p>
+      <w:pPr>
+        <w:pStyle w:val="ListBullet"/>
+      </w:pPr>
+      <w:r>
+        <w:t>Rising Sun, ETL Lab and every product are owned by Dr. O and ETL Lab. The partnership gives the school no ownership, including of anything made during it.</w:t>
+      </w:r>
+    </w:p>
+    <w:p>
+      <w:pPr>
+        <w:pStyle w:val="ListBullet"/>
+      </w:pPr>
+      <w:r>
+        <w:t>Dr. O’s work in AI and emerging technology is outside her faculty appointment in medicine. It was paid for by her, including her Harvard program, and is built on her own equipment and accounts.</w:t>
+      </w:r>
+    </w:p>
+    <w:p>
+      <w:pPr>
+        <w:pStyle w:val="ListBullet"/>
+      </w:pPr>
+      <w:r>
+        <w:t>Students and interns sign an agreement assigning what they make for the project to ETL Lab.</w:t>
+      </w:r>
+    </w:p>
+    <w:p>
+      <w:pPr>
+        <w:pStyle w:val="ListBullet"/>
+      </w:pPr>
+      <w:r>
+        <w:t>The school receives a named partnership, credit, and the right to use the work for teaching. It does not receive a share.</w:t>
+      </w:r>
+    </w:p>
+    <w:p>
+      <w:pPr>
+        <w:pStyle w:val="ListBullet"/>
+      </w:pPr>
+      <w:r>
+        <w:t>Nothing is built on university computers or in university space in a way that gives the school a claim.</w:t>
+      </w:r>
+    </w:p>
+    <w:p>
+      <w:pPr>
+        <w:pStyle w:val="ListBullet"/>
+      </w:pPr>
+      <w:r>
+        <w:t>Either side can end the partnership with notice, and Dr. O’s rights continue after it ends.</w:t>
+      </w:r>
+    </w:p>
+    <w:p>
+      <w:pPr>
+        <w:pStyle w:val="ListBullet"/>
+      </w:pPr>
+      <w:r>
+        <w:t>What the university must sign for the cloud credits is confirmed with AWS and Azure first.</w:t>
+      </w:r>
+    </w:p>
     <w:sectPr>
       <w:pgSz w:w="12240" w:h="15840"/>
       <w:pgMar w:top="1296" w:right="1296" w:bottom="1296" w:left="1296" w:header="720" w:footer="720" w:gutter="0"/>

</xml_diff>

<commit_message>
Lobby back to the earlier Astra-9 picture; concept photo goes in the dean document
Co-Authored-By: Claude Sonnet 5.5 <noreply@anthropic.com>
Claude-Session: https://claude.ai/code/session_01HHRsqL7L57Qm5aUfHKQdYK
</commit_message>
<xml_diff>
--- a/rising-sun/Rising-Sun_Price-List_2026-10-20.docx
+++ b/rising-sun/Rising-Sun_Price-List_2026-10-20.docx
@@ -2427,6 +2427,57 @@
         <w:t>The vision, designed by Dr. O: a store at the front and a workshop at the back behind a glass window, so visitors can watch the work. A 3D printer makes the figurines, and a poster shows all of them so children can guess which one is being printed. The workers wear aprons, like a cobbler’s shop. Robots greet you at the door, and there is tea with a bot and a fireside chat. A figurine talks when it is placed on a bench. Cubicles let visitors try the software products, and holo boxes let them sit and talk with a hologram. The Rising Sun Court fairy lines are sold there. Students intern in the workshop and learn how the robots and the products are made, from the ground up.</w:t>
       </w:r>
     </w:p>
+    <w:p>
+      <w:pPr>
+        <w:jc w:val="center"/>
+      </w:pPr>
+      <w:r>
+        <w:drawing>
+          <wp:inline xmlns:a="http://schemas.openxmlformats.org/drawingml/2006/main" xmlns:pic="http://schemas.openxmlformats.org/drawingml/2006/picture">
+            <wp:extent cx="4754880" cy="3550310"/>
+            <wp:docPr id="1" name="Picture 1"/>
+            <wp:cNvGraphicFramePr>
+              <a:graphicFrameLocks noChangeAspect="1"/>
+            </wp:cNvGraphicFramePr>
+            <a:graphic>
+              <a:graphicData uri="http://schemas.openxmlformats.org/drawingml/2006/picture">
+                <pic:pic>
+                  <pic:nvPicPr>
+                    <pic:cNvPr id="0" name="astra9-astrad-stage-thumb-v3.jpg"/>
+                    <pic:cNvPicPr/>
+                  </pic:nvPicPr>
+                  <pic:blipFill>
+                    <a:blip r:embed="rId11"/>
+                    <a:stretch>
+                      <a:fillRect/>
+                    </a:stretch>
+                  </pic:blipFill>
+                  <pic:spPr>
+                    <a:xfrm>
+                      <a:off x="0" y="0"/>
+                      <a:ext cx="4754880" cy="3550310"/>
+                    </a:xfrm>
+                    <a:prstGeom prst="rect"/>
+                  </pic:spPr>
+                </pic:pic>
+              </a:graphicData>
+            </a:graphic>
+          </wp:inline>
+        </w:drawing>
+      </w:r>
+    </w:p>
+    <w:p>
+      <w:pPr>
+        <w:jc w:val="center"/>
+      </w:pPr>
+      <w:r>
+        <w:rPr>
+          <w:b w:val="0"/>
+          <w:i/>
+        </w:rPr>
+        <w:t>Concept image: a fireside chat with two of the lab’s robots, on a stage with the Emerging Technologies Laboratory sign.</w:t>
+      </w:r>
+    </w:p>
     <w:tbl>
       <w:tblPr>
         <w:tblStyle w:val="TableGrid"/>

</xml_diff>